<commit_message>
Update to 0.1.435470: map search, Data Tile Management, secondary map server, Layer and Tools buttons, scale bar and ruler
</commit_message>
<xml_diff>
--- a/docs/YourCommunityCommunications-GettingStarted.docx
+++ b/docs/YourCommunityCommunications-GettingStarted.docx
@@ -3837,6 +3837,56 @@
       </w:r>
       <w:r>
         <w:t xml:space="preserve">.</w:t>
+      </w:r>
+    </w:p>
+    <w:p>
+      <w:r>
+        <w:t xml:space="preserve">â€¢ </w:t>
+      </w:r>
+      <w:r>
+        <w:rPr>
+          <w:b/>
+        </w:rPr>
+        <w:t xml:space="preserve">Full map:</w:t>
+      </w:r>
+      <w:r>
+        <w:t xml:space="preserve"> the buttons at the top left are </w:t>
+      </w:r>
+      <w:r>
+        <w:rPr>
+          <w:b/>
+        </w:rPr>
+        <w:t xml:space="preserve">Search</w:t>
+      </w:r>
+      <w:r>
+        <w:t xml:space="preserve"> (places, offline country lists can be downloaded), </w:t>
+      </w:r>
+      <w:r>
+        <w:rPr>
+          <w:b/>
+        </w:rPr>
+        <w:t xml:space="preserve">Layer</w:t>
+      </w:r>
+      <w:r>
+        <w:t xml:space="preserve"> (street, satellite or topographic) and </w:t>
+      </w:r>
+      <w:r>
+        <w:rPr>
+          <w:b/>
+        </w:rPr>
+        <w:t xml:space="preserve">Tools</w:t>
+      </w:r>
+      <w:r>
+        <w:t xml:space="preserve"> (a ruler: tap two points for the distance and bearing). The scale bar sits under them. The map menu has </w:t>
+      </w:r>
+      <w:r>
+        <w:rPr>
+          <w:b/>
+        </w:rPr>
+        <w:t xml:space="preserve">Data Tile Management</w:t>
+      </w:r>
+      <w:r>
+        <w:t xml:space="preserve"> to save a 5, 10 or 20 km area for offline use.</w:t>
       </w:r>
     </w:p>
     <w:p>

</xml_diff>